<commit_message>
style: update content template
Co-Authored-By: Claude Sonnet 5 <noreply@anthropic.com>
</commit_message>
<xml_diff>
--- a/skills/dilon-document-compiler/templates/TEMPLATE_Word_Content.docx
+++ b/skills/dilon-document-compiler/templates/TEMPLATE_Word_Content.docx
@@ -144,88 +144,6 @@
           <w:lang w:bidi="he-IL"/>
         </w:rPr>
       </w:pPr>
-      <w:r>
-        <w:rPr>
-          <w:noProof/>
-          <w:lang w:bidi="he-IL"/>
-        </w:rPr>
-        <mc:AlternateContent>
-          <mc:Choice Requires="wps">
-            <w:drawing>
-              <wp:anchor distT="0" distB="0" distL="114300" distR="114300" simplePos="0" relativeHeight="251658257" behindDoc="1" locked="0" layoutInCell="1" allowOverlap="1" wp14:anchorId="0D3FE3D6" wp14:editId="06E7FF5A">
-                <wp:simplePos x="0" y="0"/>
-                <wp:positionH relativeFrom="column">
-                  <wp:posOffset>-95250</wp:posOffset>
-                </wp:positionH>
-                <wp:positionV relativeFrom="paragraph">
-                  <wp:posOffset>142875</wp:posOffset>
-                </wp:positionV>
-                <wp:extent cx="5915025" cy="2713355"/>
-                <wp:effectExtent l="0" t="0" r="28575" b="10795"/>
-                <wp:wrapNone/>
-                <wp:docPr id="2" name="Rectangle 2"/>
-                <wp:cNvGraphicFramePr>
-                  <a:graphicFrameLocks xmlns:a="http://schemas.openxmlformats.org/drawingml/2006/main"/>
-                </wp:cNvGraphicFramePr>
-                <a:graphic xmlns:a="http://schemas.openxmlformats.org/drawingml/2006/main">
-                  <a:graphicData uri="http://schemas.microsoft.com/office/word/2010/wordprocessingShape">
-                    <wps:wsp>
-                      <wps:cNvSpPr>
-                        <a:spLocks noChangeArrowheads="1"/>
-                      </wps:cNvSpPr>
-                      <wps:spPr bwMode="auto">
-                        <a:xfrm>
-                          <a:off x="0" y="0"/>
-                          <a:ext cx="5915025" cy="2713355"/>
-                        </a:xfrm>
-                        <a:prstGeom prst="rect">
-                          <a:avLst/>
-                        </a:prstGeom>
-                        <a:solidFill>
-                          <a:srgbClr val="FFFFFF"/>
-                        </a:solidFill>
-                        <a:ln w="9525">
-                          <a:solidFill>
-                            <a:srgbClr val="000000"/>
-                          </a:solidFill>
-                          <a:miter lim="800000"/>
-                          <a:headEnd/>
-                          <a:tailEnd/>
-                        </a:ln>
-                      </wps:spPr>
-                      <wps:txbx>
-                        <w:txbxContent>
-                          <w:p/>
-                        </w:txbxContent>
-                      </wps:txbx>
-                      <wps:bodyPr rot="0" vert="horz" wrap="square" lIns="91440" tIns="45720" rIns="91440" bIns="45720" anchor="t" anchorCtr="0" upright="1">
-                        <a:noAutofit/>
-                      </wps:bodyPr>
-                    </wps:wsp>
-                  </a:graphicData>
-                </a:graphic>
-                <wp14:sizeRelH relativeFrom="page">
-                  <wp14:pctWidth>0</wp14:pctWidth>
-                </wp14:sizeRelH>
-                <wp14:sizeRelV relativeFrom="page">
-                  <wp14:pctHeight>0</wp14:pctHeight>
-                </wp14:sizeRelV>
-              </wp:anchor>
-            </w:drawing>
-          </mc:Choice>
-          <mc:Fallback>
-            <w:pict>
-              <v:rect w14:anchorId="0D3FE3D6" id="Rectangle 2" o:spid="_x0000_s1026" style="position:absolute;margin-left:-7.5pt;margin-top:11.25pt;width:465.75pt;height:213.65pt;z-index:-251658223;visibility:visible;mso-wrap-style:square;mso-width-percent:0;mso-height-percent:0;mso-wrap-distance-left:9pt;mso-wrap-distance-top:0;mso-wrap-distance-right:9pt;mso-wrap-distance-bottom:0;mso-position-horizontal:absolute;mso-position-horizontal-relative:text;mso-position-vertical:absolute;mso-position-vertical-relative:text;mso-width-percent:0;mso-height-percent:0;mso-width-relative:page;mso-height-relative:page;v-text-anchor:top" o:gfxdata="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">
-                <v:textbox>
-                  <w:txbxContent>
-                    <w:p/>
-                  </w:txbxContent>
-                </v:textbox>
-              </v:rect>
-            </w:pict>
-          </mc:Fallback>
-        </mc:AlternateContent>
-      </w:r>
     </w:p>
     <w:p>
       <w:pPr>
@@ -234,19 +152,11 @@
           <w:rStyle w:val="Strong"/>
         </w:rPr>
       </w:pPr>
-      <w:proofErr w:type="gramStart"/>
       <w:r>
         <w:rPr>
           <w:rStyle w:val="Strong"/>
         </w:rPr>
-        <w:t>Master</w:t>
-      </w:r>
-      <w:proofErr w:type="gramEnd"/>
-      <w:r>
-        <w:rPr>
-          <w:rStyle w:val="Strong"/>
-        </w:rPr>
-        <w:t xml:space="preserve"> Document</w:t>
+        <w:t>Master Document</w:t>
       </w:r>
     </w:p>
     <w:p>
@@ -8728,15 +8638,7 @@
 </file>
 
 <file path=customXml/item1.xml><?xml version="1.0" encoding="utf-8"?>
-<p:properties xmlns:p="http://schemas.microsoft.com/office/2006/metadata/properties" xmlns:xsi="http://www.w3.org/2001/XMLSchema-instance" xmlns:pc="http://schemas.microsoft.com/office/infopath/2007/PartnerControls">
-  <documentManagement>
-    <TaxCatchAll xmlns="14fbb133-db97-4d09-8590-d31f72208e11" xsi:nil="true"/>
-    <lcf76f155ced4ddcb4097134ff3c332f xmlns="ff91e89a-fa89-409e-b2c2-0afa0b8362dc">
-      <Terms xmlns="http://schemas.microsoft.com/office/infopath/2007/PartnerControls"/>
-    </lcf76f155ced4ddcb4097134ff3c332f>
-    <Index xmlns="ff91e89a-fa89-409e-b2c2-0afa0b8362dc" xsi:nil="true"/>
-  </documentManagement>
-</p:properties>
+<b:Sources xmlns:b="http://schemas.openxmlformats.org/officeDocument/2006/bibliography" xmlns="http://schemas.openxmlformats.org/officeDocument/2006/bibliography" SelectedStyle="\APASixthEditionOfficeOnline.xsl" StyleName="APA" Version="6"/>
 </file>
 
 <file path=customXml/item2.xml><?xml version="1.0" encoding="utf-8"?>
@@ -8947,7 +8849,15 @@
 </file>
 
 <file path=customXml/item3.xml><?xml version="1.0" encoding="utf-8"?>
-<b:Sources xmlns:b="http://schemas.openxmlformats.org/officeDocument/2006/bibliography" xmlns="http://schemas.openxmlformats.org/officeDocument/2006/bibliography" SelectedStyle="\APASixthEditionOfficeOnline.xsl" StyleName="APA" Version="6"/>
+<p:properties xmlns:p="http://schemas.microsoft.com/office/2006/metadata/properties" xmlns:xsi="http://www.w3.org/2001/XMLSchema-instance" xmlns:pc="http://schemas.microsoft.com/office/infopath/2007/PartnerControls">
+  <documentManagement>
+    <TaxCatchAll xmlns="14fbb133-db97-4d09-8590-d31f72208e11" xsi:nil="true"/>
+    <lcf76f155ced4ddcb4097134ff3c332f xmlns="ff91e89a-fa89-409e-b2c2-0afa0b8362dc">
+      <Terms xmlns="http://schemas.microsoft.com/office/infopath/2007/PartnerControls"/>
+    </lcf76f155ced4ddcb4097134ff3c332f>
+    <Index xmlns="ff91e89a-fa89-409e-b2c2-0afa0b8362dc" xsi:nil="true"/>
+  </documentManagement>
+</p:properties>
 </file>
 
 <file path=customXml/item4.xml><?xml version="1.0" encoding="utf-8"?>
@@ -8960,12 +8870,9 @@
 </file>
 
 <file path=customXml/itemProps1.xml><?xml version="1.0" encoding="utf-8"?>
-<ds:datastoreItem xmlns:ds="http://schemas.openxmlformats.org/officeDocument/2006/customXml" ds:itemID="{D1B430AD-7F5E-4A6C-AC1E-18B5A5C8823C}">
+<ds:datastoreItem xmlns:ds="http://schemas.openxmlformats.org/officeDocument/2006/customXml" ds:itemID="{79F96F0D-53C7-457F-BF3B-DB3D5A728589}">
   <ds:schemaRefs>
-    <ds:schemaRef ds:uri="http://schemas.microsoft.com/office/2006/metadata/properties"/>
-    <ds:schemaRef ds:uri="http://schemas.microsoft.com/office/infopath/2007/PartnerControls"/>
-    <ds:schemaRef ds:uri="14fbb133-db97-4d09-8590-d31f72208e11"/>
-    <ds:schemaRef ds:uri="ff91e89a-fa89-409e-b2c2-0afa0b8362dc"/>
+    <ds:schemaRef ds:uri="http://schemas.openxmlformats.org/officeDocument/2006/bibliography"/>
   </ds:schemaRefs>
 </ds:datastoreItem>
 </file>
@@ -8990,9 +8897,12 @@
 </file>
 
 <file path=customXml/itemProps3.xml><?xml version="1.0" encoding="utf-8"?>
-<ds:datastoreItem xmlns:ds="http://schemas.openxmlformats.org/officeDocument/2006/customXml" ds:itemID="{79F96F0D-53C7-457F-BF3B-DB3D5A728589}">
+<ds:datastoreItem xmlns:ds="http://schemas.openxmlformats.org/officeDocument/2006/customXml" ds:itemID="{D1B430AD-7F5E-4A6C-AC1E-18B5A5C8823C}">
   <ds:schemaRefs>
-    <ds:schemaRef ds:uri="http://schemas.openxmlformats.org/officeDocument/2006/bibliography"/>
+    <ds:schemaRef ds:uri="http://schemas.microsoft.com/office/2006/metadata/properties"/>
+    <ds:schemaRef ds:uri="http://schemas.microsoft.com/office/infopath/2007/PartnerControls"/>
+    <ds:schemaRef ds:uri="14fbb133-db97-4d09-8590-d31f72208e11"/>
+    <ds:schemaRef ds:uri="ff91e89a-fa89-409e-b2c2-0afa0b8362dc"/>
   </ds:schemaRefs>
 </ds:datastoreItem>
 </file>

</xml_diff>